<commit_message>
feat(contratos): reformulacao integral dos 30 contratos com densidade juridica real, clausulas completas, notas tecnicas e sincronizacao do portal e zip
</commit_message>
<xml_diff>
--- a/public/downloads/01_Contrato_Compra_e_Venda_Imovel.docx
+++ b/public/downloads/01_Contrato_Compra_e_Venda_Imovel.docx
@@ -8,12 +8,12 @@
       </w:pPr>
       <w:r>
         <w:rPr>
-          <w:rFonts w:ascii="Arial" w:hAnsi="Arial"/>
+          <w:rFonts w:ascii="Times New Roman" w:hAnsi="Times New Roman"/>
           <w:b/>
-          <w:color w:val="1A2C4C"/>
+          <w:color w:val="0A192F"/>
           <w:sz w:val="26"/>
         </w:rPr>
-        <w:t>CONTRATO DE COMPRA E VENDA DE IMÓVEL (À VISTA E PARCELADO)</w:t>
+        <w:t>INSTRUMENTO PARTICULAR DE PROMESSA DE COMPRA E VENDA DE BEM IMÓVEL COM ARRAS E CLÁUSULA RESOLUTIVA EXPRESSA</w:t>
       </w:r>
     </w:p>
     <w:p>
@@ -22,12 +22,12 @@
       </w:pPr>
       <w:r>
         <w:rPr>
-          <w:rFonts w:ascii="Arial" w:hAnsi="Arial"/>
+          <w:rFonts w:ascii="Times New Roman" w:hAnsi="Times New Roman"/>
           <w:i/>
-          <w:color w:val="787878"/>
-          <w:sz w:val="19"/>
+          <w:color w:val="5A5A5A"/>
+          <w:sz w:val="20"/>
         </w:rPr>
-        <w:t>Acervo de Segurança Jurídica • Módulo 1: Transações Imobiliárias • Banca Andrade &amp; Florio</w:t>
+        <w:t>Regido pelos Artigos 417 a 420, 462 a 466 e 474 do Código Civil Brasileiro</w:t>
       </w:r>
     </w:p>
     <w:p/>
@@ -45,7 +45,7 @@
         <w:tc>
           <w:tcPr>
             <w:tcW w:type="dxa" w:w="9360"/>
-            <w:shd w:fill="F4F5F7"/>
+            <w:shd w:fill="F8F9FA"/>
           </w:tcPr>
           <w:p>
             <w:pPr>
@@ -56,10 +56,12 @@
               <w:rPr>
                 <w:rFonts w:ascii="Arial" w:hAnsi="Arial"/>
                 <w:b/>
-                <w:color w:val="B48214"/>
-                <w:sz w:val="19"/>
+                <w:color w:val="8C640F"/>
+                <w:sz w:val="18"/>
               </w:rPr>
-              <w:t>💡 NOTA TÉCNICA DO ADVOGADO: Antes do pagamento do sinal, exija Matrícula Atualizada com Certidão de Ônus Reais vintenária e certidões negativas de ações cíveis e trabalhistas do Vendedor.</w:t>
+              <w:t>ORIENTAÇÃO TÉCNICA E SEGURANÇA JURÍDICA (ANDRADE &amp; FLORIO):</w:t>
+              <w:br/>
+              <w:t>Antes de efetuar o pagamento de qualquer sinal (arras), é dever inescusável do adquirente exigir: 1) Matrícula imobiliária atualizada com certidão de ônus e ações reais (vintenária); 2) Certidões negativas de distribuidores cíveis, fiscais e trabalhistas do vendedor e de seus antecessores; 3) Certidão negativa de tributos municipais e de débitos condominiais emitida pelo síndico com ata de eleição.</w:t>
             </w:r>
           </w:p>
         </w:tc>
@@ -68,156 +70,419 @@
     <w:p/>
     <w:p>
       <w:pPr>
-        <w:pStyle w:val="Heading2"/>
+        <w:spacing w:line="300" w:lineRule="auto" w:after="240"/>
+        <w:jc w:val="both"/>
       </w:pPr>
       <w:r>
-        <w:t>QUALIFICAÇÃO DAS PARTES</w:t>
-      </w:r>
-    </w:p>
-    <w:p>
-      <w:r>
-        <w:t>VENDEDOR(A): [NOME COMPLETO], [nacionalidade], [estado civil], RG nº [RG], CPF nº [CPF], residente na [ENDEREÇO COMPLETO].</w:t>
+        <w:rPr>
+          <w:rFonts w:ascii="Times New Roman" w:hAnsi="Times New Roman"/>
+          <w:color w:val="1E1E1E"/>
+          <w:sz w:val="22"/>
+        </w:rPr>
+        <w:t>Pelo presente Instrumento Particular de Promessa de Compra e Venda de Bem Imóvel, celebrado com fundamento na legislação civil em vigor, têm entre si, de um lado, como PROMITENTE(S) VENDEDOR(ES):</w:t>
         <w:br/>
-        <w:t>COMPRADOR(A): [NOME COMPLETO], [nacionalidade], [estado civil], RG nº [RG], CPF nº [CPF], residente na [ENDEREÇO COMPLETO].</w:t>
+        <w:br/>
+        <w:t>[NOME COMPLETO DO VENDEDOR], [nacionalidade], [estado civil - se casado, indicar regime de bens e existência de pacto antenupcial], [profissão], portador(a) da cédula de identidade RG nº [NÚMERO], inscrito(a) no CPF/MF sob o nº [NÚMERO], e seu cônjuge/companheiro(a) [NOME DO CÔNJUGE], [nacionalidade], [profissão], RG nº [NÚMERO], CPF nº [NÚMERO], ambos residentes e domiciliados na [ENDEREÇO COMPLETO COM CEP], doravante denominados conjuntamente VENDEDORES;</w:t>
+        <w:br/>
+        <w:br/>
+        <w:t>E, de outro lado, como PROMISSÁRIO(S) COMPRADOR(ES):</w:t>
+        <w:br/>
+        <w:br/>
+        <w:t>[NOME COMPLETO DO COMPRADOR], [nacionalidade], [estado civil], [profissão], portador(a) da cédula de identidade RG nº [NÚMERO], inscrito(a) no CPF/MF sob o nº [NÚMERO], e seu cônjuge/companheiro(a) [NOME DO CÔNJUGE], [nacionalidade], [profissão], RG nº [NÚMERO], CPF nº [NÚMERO], ambos residentes e domiciliados na [ENDEREÇO COMPLETO COM CEP], doravante denominados conjuntamente COMPRADORES;</w:t>
+        <w:br/>
+        <w:br/>
+        <w:t>Têm as partes entre si justo, convencionado e contratado o que se expressa mediante as cláusulas e condições seguintes:</w:t>
       </w:r>
     </w:p>
     <w:p>
       <w:pPr>
-        <w:spacing w:before="200" w:after="40"/>
+        <w:spacing w:before="240" w:after="60"/>
       </w:pPr>
       <w:r>
         <w:rPr>
-          <w:rFonts w:ascii="Arial" w:hAnsi="Arial"/>
+          <w:rFonts w:ascii="Times New Roman" w:hAnsi="Times New Roman"/>
           <w:b/>
-          <w:color w:val="1A2C4C"/>
+          <w:color w:val="0A192F"/>
           <w:sz w:val="22"/>
         </w:rPr>
-        <w:t>CLÁUSULA PRIMEIRA – DO OBJETO</w:t>
+        <w:t>CLÁUSULA PRIMEIRA – DO OBJETO E CARACTERIZAÇÃO REGISTRAL</w:t>
       </w:r>
     </w:p>
     <w:p>
       <w:pPr>
-        <w:spacing w:before="0" w:after="120" w:line="276" w:lineRule="auto"/>
+        <w:spacing w:before="0" w:after="160" w:line="300" w:lineRule="auto"/>
+        <w:jc w:val="both"/>
       </w:pPr>
       <w:r>
         <w:rPr>
-          <w:rFonts w:ascii="Arial" w:hAnsi="Arial"/>
-          <w:color w:val="282828"/>
-          <w:sz w:val="20"/>
+          <w:rFonts w:ascii="Times New Roman" w:hAnsi="Times New Roman"/>
+          <w:color w:val="1E1E1E"/>
+          <w:sz w:val="21"/>
         </w:rPr>
-        <w:t>O presente contrato tem por objeto a promessa de compra e venda irrevogável e irretratável do bem imóvel situado na [ENDEREÇO COMPLETO DO IMÓVEL], Matrícula nº [NÚMERO], do Cartório de Registro de Imóveis da Comarca de [CIDADE/UF].</w:t>
+        <w:t>1.1. O presente contrato tem por objeto a promessa de compra e venda irrevogável e irretratável do bem imóvel urbano [ou rural] situado na [ENDEREÇO COMPLETO DO IMÓVEL, BAIRRO, CIDADE, ESTADO, CEP], com área privativa de [XX] m², área comum de [XX] m², totalizando [XX] m², com as confrontações e limites descritos na matrícula imobiliária nº [NÚMERO DA MATRÍCULA], registrada perante o [NÚMERO DO OFÍCIO] Cartório de Registro de Imóveis da Comarca de [CIDADE/UF], com inscrição cadastral de IPTU nº [NÚMERO DO IPTU].</w:t>
+        <w:br/>
+        <w:br/>
+        <w:t>1.2. O imóvel será transferido completamente livre e desembaraçado de quaisquer ônus judiciais ou extrajudiciais, hipotecas legais ou convencionais, penhoras, cauções, arrestos, ações reais ou reipersecutórias, bem como de tributos ou taxas de qualquer espécie, até a data da transmissão da posse direta.</w:t>
       </w:r>
     </w:p>
     <w:p>
       <w:pPr>
-        <w:spacing w:before="200" w:after="40"/>
+        <w:spacing w:before="240" w:after="60"/>
       </w:pPr>
       <w:r>
         <w:rPr>
-          <w:rFonts w:ascii="Arial" w:hAnsi="Arial"/>
+          <w:rFonts w:ascii="Times New Roman" w:hAnsi="Times New Roman"/>
           <w:b/>
-          <w:color w:val="1A2C4C"/>
+          <w:color w:val="0A192F"/>
           <w:sz w:val="22"/>
         </w:rPr>
-        <w:t>CLÁUSULA SEGUNDA – DO PREÇO E CONDIÇÕES</w:t>
+        <w:t>CLÁUSULA SEGUNDA – DA MODALIDADE 'AD CORPUS' E ESTADO DE CONSERVAÇÃO</w:t>
       </w:r>
     </w:p>
     <w:p>
       <w:pPr>
-        <w:spacing w:before="0" w:after="120" w:line="276" w:lineRule="auto"/>
+        <w:spacing w:before="0" w:after="160" w:line="300" w:lineRule="auto"/>
+        <w:jc w:val="both"/>
       </w:pPr>
       <w:r>
         <w:rPr>
-          <w:rFonts w:ascii="Arial" w:hAnsi="Arial"/>
-          <w:color w:val="282828"/>
-          <w:sz w:val="20"/>
+          <w:rFonts w:ascii="Times New Roman" w:hAnsi="Times New Roman"/>
+          <w:color w:val="1E1E1E"/>
+          <w:sz w:val="21"/>
         </w:rPr>
-        <w:t>O preço total ajustado é de R$ [VALOR POR EXTENSO], pago da seguinte forma: Sinal de R$ [VALOR] nesta data via PIX, e o saldo restante de R$ [VALOR] no ato da Escritura Pública ou mediante financiamento bancário no prazo de [XX] dias.</w:t>
+        <w:t>2.1. O presente negócio jurídico é estipulado na modalidade 'ad corpus' (Art. 500, § 3º do Código Civil), tendo o COMPRADOR examinado previamente o imóvel, suas medidas, dependências e instalações, aceitando-o no estado em que se encontra, sendo meramente enunciativas as referências às dimensões constantes deste contrato.</w:t>
+        <w:br/>
+        <w:br/>
+        <w:t>2.2. O VENDEDOR declara, sob as penas da lei, inexistir vício redibitório oculto ou defeito estrutural grave de seu conhecimento que comprometa a habitualidade, solidez ou valor econômico do bem.</w:t>
       </w:r>
     </w:p>
     <w:p>
       <w:pPr>
-        <w:spacing w:before="200" w:after="40"/>
+        <w:spacing w:before="240" w:after="60"/>
       </w:pPr>
       <w:r>
         <w:rPr>
-          <w:rFonts w:ascii="Arial" w:hAnsi="Arial"/>
+          <w:rFonts w:ascii="Times New Roman" w:hAnsi="Times New Roman"/>
           <w:b/>
-          <w:color w:val="1A2C4C"/>
+          <w:color w:val="0A192F"/>
           <w:sz w:val="22"/>
         </w:rPr>
-        <w:t>CLÁUSULA TERCEIRA – DAS ARRAS (SINAL)</w:t>
+        <w:t>CLÁUSULA TERCEIRA – DO PREÇO E CRONOGRAMA DE PAGAMENTO</w:t>
       </w:r>
     </w:p>
     <w:p>
       <w:pPr>
-        <w:spacing w:before="0" w:after="120" w:line="276" w:lineRule="auto"/>
+        <w:spacing w:before="0" w:after="160" w:line="300" w:lineRule="auto"/>
+        <w:jc w:val="both"/>
       </w:pPr>
       <w:r>
         <w:rPr>
-          <w:rFonts w:ascii="Arial" w:hAnsi="Arial"/>
-          <w:color w:val="282828"/>
-          <w:sz w:val="20"/>
+          <w:rFonts w:ascii="Times New Roman" w:hAnsi="Times New Roman"/>
+          <w:color w:val="1E1E1E"/>
+          <w:sz w:val="21"/>
         </w:rPr>
-        <w:t>As arras têm natureza confirmatória (Art. 417 do CC). A desistência pelo Comprador acarreta perda do sinal; a desistência pelo Vendedor enseja devolução em dobro com juros.</w:t>
+        <w:t>3.1. O preço total, certo e ajustado para a compra e venda do imóvel é de R$ [VALOR TOTAL POR EXTENSO], a ser integralmente pago pelo COMPRADOR nas seguintes condições:</w:t>
+        <w:br/>
+        <w:br/>
+        <w:t>a) SINAL E PRINCÍPIO DE PAGAMENTO (ARRAS): R$ [VALOR DO SINAL POR EXTENSO], pago nesta data via [Transferência Bancária PIX / TED para a conta bancária de titularidade do Vendedor: Banco [NOME], Agência [Nº], Conta [Nº], Chave Pix [CHAVE]], servindo o comprovante como quitação deste sinal;</w:t>
+        <w:br/>
+        <w:br/>
+        <w:t>b) PARCELA DO SALDO DEVEDOR: O valor restante de R$ [VALOR DO SALDO POR EXTENSO] será pago impreterivelmente no ato da outorga da Escritura Pública Definitiva de Compra e Venda perante o Tabelião de Notas [ou mediante liberação de carta de crédito / financiamento imobiliário bancário no prazo máximo de [45] dias].</w:t>
       </w:r>
     </w:p>
     <w:p>
       <w:pPr>
-        <w:spacing w:before="200" w:after="40"/>
+        <w:spacing w:before="240" w:after="60"/>
       </w:pPr>
       <w:r>
         <w:rPr>
-          <w:rFonts w:ascii="Arial" w:hAnsi="Arial"/>
+          <w:rFonts w:ascii="Times New Roman" w:hAnsi="Times New Roman"/>
           <w:b/>
-          <w:color w:val="1A2C4C"/>
+          <w:color w:val="0A192F"/>
           <w:sz w:val="22"/>
         </w:rPr>
-        <w:t>CLÁUSULA QUARTA – CLÁUSULA RESOLUTIVA EXPRESSA (ART. 474 DO CC)</w:t>
+        <w:t>CLÁUSULA QUARTA – DA NATUREZA DAS ARRAS E IRRETRATABILIDADE</w:t>
       </w:r>
     </w:p>
     <w:p>
       <w:pPr>
-        <w:spacing w:before="0" w:after="120" w:line="276" w:lineRule="auto"/>
+        <w:spacing w:before="0" w:after="160" w:line="300" w:lineRule="auto"/>
+        <w:jc w:val="both"/>
       </w:pPr>
       <w:r>
         <w:rPr>
-          <w:rFonts w:ascii="Arial" w:hAnsi="Arial"/>
-          <w:color w:val="282828"/>
-          <w:sz w:val="20"/>
+          <w:rFonts w:ascii="Times New Roman" w:hAnsi="Times New Roman"/>
+          <w:color w:val="1E1E1E"/>
+          <w:sz w:val="21"/>
         </w:rPr>
-        <w:t>O não pagamento de qualquer parcela faculta a rescisão imediata de pleno direito, independentemente de ação judicial prévia, após notificação de 15 dias.</w:t>
+        <w:t>4.1. As arras ora pactuadas possuem natureza confirmatória (Art. 417 do Código Civil). Havendo inexecução ou desistência culposa por parte do COMPRADOR, este perderá o sinal pago em favor do VENDEDOR. Caso a inexecução ou desistência decorra de culpa exclusiva do VENDEDOR, este restituirá o sinal recebido em dobro ao COMPRADOR, acrescido de correção monetária pelo IPCA e juros legais.</w:t>
+        <w:br/>
+        <w:br/>
+        <w:t>4.2. Salvo as exceções expressas de impedimento registral decorrentes de certidões positivas na Cláusula Sétima, o contrato é irrevogável e irretratável (Art. 420 CC).</w:t>
       </w:r>
     </w:p>
     <w:p>
+      <w:pPr>
+        <w:spacing w:before="240" w:after="60"/>
+      </w:pPr>
       <w:r>
+        <w:rPr>
+          <w:rFonts w:ascii="Times New Roman" w:hAnsi="Times New Roman"/>
+          <w:b/>
+          <w:color w:val="0A192F"/>
+          <w:sz w:val="22"/>
+        </w:rPr>
+        <w:t>CLÁUSULA QUINTA – DA CLÁUSULA RESOLUTIVA EXPRESSA (ART. 474 DO CC)</w:t>
+      </w:r>
+    </w:p>
+    <w:p>
+      <w:pPr>
+        <w:spacing w:before="0" w:after="160" w:line="300" w:lineRule="auto"/>
+        <w:jc w:val="both"/>
+      </w:pPr>
+      <w:r>
+        <w:rPr>
+          <w:rFonts w:ascii="Times New Roman" w:hAnsi="Times New Roman"/>
+          <w:color w:val="1E1E1E"/>
+          <w:sz w:val="21"/>
+        </w:rPr>
+        <w:t>5.1. O inadimplemento no pagamento de qualquer parcela ou do saldo final estipulado na Cláusula Terceira operará a imediata e automática resolução de pleno direito deste contrato.</w:t>
+        <w:br/>
+        <w:br/>
+        <w:t>5.2. Para efeito de desocupação e reintegração de posse, o VENDEDOR notificará extrajudicialmente o COMPRADOR para purgar a mora em 15 (quinze) dias corridos. Não purgada a mora, o contrato considerar-se-á rescindido de pleno direito, autorizando a retenção das arras a título de indenização pré-fixada e medidas liminares possessórias.</w:t>
+      </w:r>
+    </w:p>
+    <w:p>
+      <w:pPr>
+        <w:spacing w:before="240" w:after="60"/>
+      </w:pPr>
+      <w:r>
+        <w:rPr>
+          <w:rFonts w:ascii="Times New Roman" w:hAnsi="Times New Roman"/>
+          <w:b/>
+          <w:color w:val="0A192F"/>
+          <w:sz w:val="22"/>
+        </w:rPr>
+        <w:t>CLÁUSULA SEXTA – DA IMISSÃO NA POSSE E ENCARGOS</w:t>
+      </w:r>
+    </w:p>
+    <w:p>
+      <w:pPr>
+        <w:spacing w:before="0" w:after="160" w:line="300" w:lineRule="auto"/>
+        <w:jc w:val="both"/>
+      </w:pPr>
+      <w:r>
+        <w:rPr>
+          <w:rFonts w:ascii="Times New Roman" w:hAnsi="Times New Roman"/>
+          <w:color w:val="1E1E1E"/>
+          <w:sz w:val="21"/>
+        </w:rPr>
+        <w:t>6.1. A posse direta do imóvel será transferida ao COMPRADOR na data de [DATA OU CONDIÇÃO - EX: quitação integral do sinal / lavratura da escritura], momento em que receberá as chaves.</w:t>
+        <w:br/>
+        <w:br/>
+        <w:t>6.2. A partir da imissão na posse, todas as despesas ordinárias de condomínio, parcelas de IPTU e tarifas de consumo (água, luz, gás) serão de inteira responsabilidade do COMPRADOR.</w:t>
+      </w:r>
+    </w:p>
+    <w:p>
+      <w:pPr>
+        <w:spacing w:before="240" w:after="60"/>
+      </w:pPr>
+      <w:r>
+        <w:rPr>
+          <w:rFonts w:ascii="Times New Roman" w:hAnsi="Times New Roman"/>
+          <w:b/>
+          <w:color w:val="0A192F"/>
+          <w:sz w:val="22"/>
+        </w:rPr>
+        <w:t>CLÁUSULA SÉTIMA – DAS CERTIDÕES OBRIGATÓRIAS E DUE DILIGENCE</w:t>
+      </w:r>
+    </w:p>
+    <w:p>
+      <w:pPr>
+        <w:spacing w:before="0" w:after="160" w:line="300" w:lineRule="auto"/>
+        <w:jc w:val="both"/>
+      </w:pPr>
+      <w:r>
+        <w:rPr>
+          <w:rFonts w:ascii="Times New Roman" w:hAnsi="Times New Roman"/>
+          <w:color w:val="1E1E1E"/>
+          <w:sz w:val="21"/>
+        </w:rPr>
+        <w:t>7.1. O VENDEDOR obriga-se a apresentar aos COMPRADORES, no prazo de 15 (quinze) dias a contar desta assinatura e às suas expensas, as seguintes certidões negativas emitidas há menos de 30 dias:</w:t>
+        <w:br/>
+        <w:t>a) Matrícula imobiliária atualizada com certidão de ônus reais vintenária e de ações reipersecutórias emitida pelo CRI competente;</w:t>
+        <w:br/>
+        <w:t>b) Certidão negativa de tributos municipais e declaração de quitação condominial assinada pelo síndico;</w:t>
+        <w:br/>
+        <w:t>c) Certidões negativas de distribuidores cíveis e executivos fiscais (Estadual e Federal) da Comarca do imóvel e do domicílio do Vendedor;</w:t>
+        <w:br/>
+        <w:t>d) Certidão Negativa de Débitos Trabalhistas (CNDT) e da Justiça do Trabalho;</w:t>
+        <w:br/>
+        <w:t>e) Consulta à Central Nacional de Indisponibilidade de Bens (CNIB).</w:t>
+        <w:br/>
+        <w:br/>
+        <w:t>7.2. Havendo certidão positiva que aponte risco de fraude contra credores ou penhora sobre o bem, assistirá ao COMPRADOR o direito de rescindir o contrato com devolução de 100% dos valores pagos, sem retenção.</w:t>
+      </w:r>
+    </w:p>
+    <w:p>
+      <w:pPr>
+        <w:spacing w:before="240" w:after="60"/>
+      </w:pPr>
+      <w:r>
+        <w:rPr>
+          <w:rFonts w:ascii="Times New Roman" w:hAnsi="Times New Roman"/>
+          <w:b/>
+          <w:color w:val="0A192F"/>
+          <w:sz w:val="22"/>
+        </w:rPr>
+        <w:t>CLÁUSULA OITAVA – DA EVICÇÃO DE DIREITO</w:t>
+      </w:r>
+    </w:p>
+    <w:p>
+      <w:pPr>
+        <w:spacing w:before="0" w:after="160" w:line="300" w:lineRule="auto"/>
+        <w:jc w:val="both"/>
+      </w:pPr>
+      <w:r>
+        <w:rPr>
+          <w:rFonts w:ascii="Times New Roman" w:hAnsi="Times New Roman"/>
+          <w:color w:val="1E1E1E"/>
+          <w:sz w:val="21"/>
+        </w:rPr>
+        <w:t>8.1. O VENDEDOR responde pela evicção de direito nos termos do artigo 447 e seguintes do Código Civil, obrigando-se a indenizar os COMPRADORES por eventuais prejuízos decorrentes de evicção judicial.</w:t>
+      </w:r>
+    </w:p>
+    <w:p>
+      <w:pPr>
+        <w:spacing w:before="240" w:after="60"/>
+      </w:pPr>
+      <w:r>
+        <w:rPr>
+          <w:rFonts w:ascii="Times New Roman" w:hAnsi="Times New Roman"/>
+          <w:b/>
+          <w:color w:val="0A192F"/>
+          <w:sz w:val="22"/>
+        </w:rPr>
+        <w:t>CLÁUSULA NONA – DAS DESPESAS CARTORÁRIAS E REGISTRAIS</w:t>
+      </w:r>
+    </w:p>
+    <w:p>
+      <w:pPr>
+        <w:spacing w:before="0" w:after="160" w:line="300" w:lineRule="auto"/>
+        <w:jc w:val="both"/>
+      </w:pPr>
+      <w:r>
+        <w:rPr>
+          <w:rFonts w:ascii="Times New Roman" w:hAnsi="Times New Roman"/>
+          <w:color w:val="1E1E1E"/>
+          <w:sz w:val="21"/>
+        </w:rPr>
+        <w:t>9.1. Todas as despesas referentes à lavratura da Escritura Pública Definitiva de Compra e Venda, ITBI (Imposto de Transmissão de Bens Imóveis) e emolumentos do Cartório de Registro de Imóveis correrão por conta exclusiva dos COMPRADORES.</w:t>
+      </w:r>
+    </w:p>
+    <w:p>
+      <w:pPr>
+        <w:spacing w:before="240" w:after="60"/>
+      </w:pPr>
+      <w:r>
+        <w:rPr>
+          <w:rFonts w:ascii="Times New Roman" w:hAnsi="Times New Roman"/>
+          <w:b/>
+          <w:color w:val="0A192F"/>
+          <w:sz w:val="22"/>
+        </w:rPr>
+        <w:t>CLÁUSULA DÉCIMA – DA CLÁUSULA PENAL</w:t>
+      </w:r>
+    </w:p>
+    <w:p>
+      <w:pPr>
+        <w:spacing w:before="0" w:after="160" w:line="300" w:lineRule="auto"/>
+        <w:jc w:val="both"/>
+      </w:pPr>
+      <w:r>
+        <w:rPr>
+          <w:rFonts w:ascii="Times New Roman" w:hAnsi="Times New Roman"/>
+          <w:color w:val="1E1E1E"/>
+          <w:sz w:val="21"/>
+        </w:rPr>
+        <w:t>10.1. A infração a qualquer cláusula deste contrato ensejará a aplicação de multa penal de 10% (dez por cento) sobre o valor total do negócio em desfavor da parte infratora, sem prejuízo de perdas e danos.</w:t>
+      </w:r>
+    </w:p>
+    <w:p>
+      <w:pPr>
+        <w:spacing w:before="240" w:after="60"/>
+      </w:pPr>
+      <w:r>
+        <w:rPr>
+          <w:rFonts w:ascii="Times New Roman" w:hAnsi="Times New Roman"/>
+          <w:b/>
+          <w:color w:val="0A192F"/>
+          <w:sz w:val="22"/>
+        </w:rPr>
+        <w:t>CLÁUSULA DÉCIMA PRIMEIRA – DO FORO</w:t>
+      </w:r>
+    </w:p>
+    <w:p>
+      <w:pPr>
+        <w:spacing w:before="0" w:after="160" w:line="300" w:lineRule="auto"/>
+        <w:jc w:val="both"/>
+      </w:pPr>
+      <w:r>
+        <w:rPr>
+          <w:rFonts w:ascii="Times New Roman" w:hAnsi="Times New Roman"/>
+          <w:color w:val="1E1E1E"/>
+          <w:sz w:val="21"/>
+        </w:rPr>
+        <w:t>11.1. As partes elegem o Foro da Comarca de [CIDADE/UF DO IMÓVEL] para dirimir quaisquer litígios deste instrumento, renunciando a qualquer outro.</w:t>
+      </w:r>
+    </w:p>
+    <w:p>
+      <w:pPr>
+        <w:spacing w:before="360" w:after="480"/>
+      </w:pPr>
+      <w:r>
+        <w:rPr>
+          <w:rFonts w:ascii="Times New Roman" w:hAnsi="Times New Roman"/>
+          <w:sz w:val="21"/>
+        </w:rPr>
+        <w:t>E, por estarem assim justas, acordadas e contratadas, as partes firmam o presente instrumento em 02 (duas) vias de igual teor e forma, na presença das 02 (duas) testemunhas instrumentárias abaixo qualificadas, que a tudo assistiram e dão fé.</w:t>
+        <w:br/>
         <w:br/>
         <w:t>[CIDADE/UF], [DIA] de [MÊS] de 202[X].</w:t>
         <w:br/>
         <w:br/>
-      </w:r>
-    </w:p>
-    <w:p>
-      <w:r>
-        <w:t>_________________________________________</w:t>
         <w:br/>
-        <w:t>PRIMEIRA PARTE / CONTRATANTE</w:t>
+        <w:t>___________________________________________________________</w:t>
+        <w:br/>
+        <w:t>PRIMEIRA PARTE</w:t>
+        <w:br/>
+        <w:t>CPF/CNPJ nº [NÚMERO]</w:t>
         <w:br/>
         <w:br/>
-        <w:t>_________________________________________</w:t>
         <w:br/>
-        <w:t>SEGUNDA PARTE / CONTRATADA</w:t>
+        <w:t>___________________________________________________________</w:t>
+        <w:br/>
+        <w:t>SEGUNDA PARTE</w:t>
+        <w:br/>
+        <w:t>CPF/CNPJ nº [NÚMERO]</w:t>
         <w:br/>
         <w:br/>
-      </w:r>
-    </w:p>
-    <w:p>
-      <w:r>
-        <w:t>TESTEMUNHAS:</w:t>
         <w:br/>
-        <w:t>1. Nome: ____________________ CPF: ______________</w:t>
+        <w:t>TESTEMUNHAS INSTRUMENTÁRIAS:</w:t>
         <w:br/>
-        <w:t>2. Nome: ____________________ CPF: ______________</w:t>
+        <w:br/>
+        <w:t>1. ______________________________________</w:t>
+        <w:br/>
+        <w:t>Nome: [NOME COMPLETO DA TESTEMUNHA 1]</w:t>
+        <w:br/>
+        <w:t>RG nº [NÚMERO] | CPF nº [NÚMERO]</w:t>
+        <w:br/>
+        <w:br/>
+        <w:t>2. ______________________________________</w:t>
+        <w:br/>
+        <w:t>Nome: [NOME COMPLETO DA TESTEMUNHA 2]</w:t>
+        <w:br/>
+        <w:t>RG nº [NÚMERO] | CPF nº [NÚMERO]</w:t>
       </w:r>
     </w:p>
     <w:sectPr>

</xml_diff>